<commit_message>
added all project files and documentation
</commit_message>
<xml_diff>
--- a/DOCUMENTATION OF BMI CALC.docx
+++ b/DOCUMENTATION OF BMI CALC.docx
@@ -413,7 +413,6 @@
           <w:sz w:val="32"/>
           <w:szCs w:val="32"/>
         </w:rPr>
-        <w:lastRenderedPageBreak/>
         <w:t xml:space="preserve">Introduction – </w:t>
       </w:r>
     </w:p>
@@ -530,6 +529,7 @@
           <w:sz w:val="28"/>
           <w:szCs w:val="28"/>
         </w:rPr>
+        <w:lastRenderedPageBreak/>
         <w:t>Daily Calorie requirement</w:t>
       </w:r>
     </w:p>
@@ -1030,6 +1030,16 @@
         </w:rPr>
         <w:t xml:space="preserve">GitHub Link: </w:t>
       </w:r>
+      <w:hyperlink r:id="rId6" w:history="1">
+        <w:r>
+          <w:rPr>
+            <w:rStyle w:val="Hyperlink"/>
+            <w:sz w:val="28"/>
+            <w:szCs w:val="28"/>
+          </w:rPr>
+          <w:t>paridhi1607/BMI-calculator-project</w:t>
+        </w:r>
+      </w:hyperlink>
     </w:p>
     <w:sectPr>
       <w:pgSz w:w="11906" w:h="16838"/>
@@ -2267,7 +2277,6 @@
   <w:style w:type="character" w:default="1" w:styleId="DefaultParagraphFont">
     <w:name w:val="Default Paragraph Font"/>
     <w:uiPriority w:val="1"/>
-    <w:semiHidden/>
     <w:unhideWhenUsed/>
   </w:style>
   <w:style w:type="table" w:default="1" w:styleId="TableNormal">
@@ -2599,6 +2608,29 @@
         <w:insideV w:val="single" w:sz="4" w:space="0" w:color="auto"/>
       </w:tblBorders>
     </w:tblPr>
+  </w:style>
+  <w:style w:type="character" w:styleId="Hyperlink">
+    <w:name w:val="Hyperlink"/>
+    <w:basedOn w:val="DefaultParagraphFont"/>
+    <w:uiPriority w:val="99"/>
+    <w:unhideWhenUsed/>
+    <w:rsid w:val="007804CE"/>
+    <w:rPr>
+      <w:color w:val="0563C1" w:themeColor="hyperlink"/>
+      <w:u w:val="single"/>
+    </w:rPr>
+  </w:style>
+  <w:style w:type="character" w:styleId="UnresolvedMention">
+    <w:name w:val="Unresolved Mention"/>
+    <w:basedOn w:val="DefaultParagraphFont"/>
+    <w:uiPriority w:val="99"/>
+    <w:semiHidden/>
+    <w:unhideWhenUsed/>
+    <w:rsid w:val="007804CE"/>
+    <w:rPr>
+      <w:color w:val="605E5C"/>
+      <w:shd w:val="clear" w:color="auto" w:fill="E1DFDD"/>
+    </w:rPr>
   </w:style>
 </w:styles>
 </file>

</xml_diff>